<commit_message>
Switch project theme to LINE local AI expense tracker
- relay_server: parse_expense, append/read expenses, expense_summary, /demo/expenses
- Code.gs: route expense messages (e.g. 咖啡 45 元) to local relay
- demo UI: expense chat flow with today/monthly totals
- docs: report, summary, slides, scripts, screenshots updated to expense theme
- tests: add 17-test suite covering expense parsing and demo APIs
</commit_message>
<xml_diff>
--- a/docs/AI對話摘要.docx
+++ b/docs/AI對話摘要.docx
@@ -996,7 +996,7 @@
           <w:color w:val="122019"/>
           <w:sz w:val="21"/>
         </w:rPr>
-        <w:t>手機版聊天 UI，可以直接點「查 玉山有多高」、「買牛奶」。</w:t>
+        <w:t>手機版聊天 UI，可以直接點「咖啡 45 元」、「Uber 60」。</w:t>
       </w:r>
     </w:p>
     <w:p>
@@ -1010,7 +1010,7 @@
           <w:color w:val="122019"/>
           <w:sz w:val="21"/>
         </w:rPr>
-        <w:t>右側顯示搜尋、生成、回覆的流程與耗時。</w:t>
+        <w:t>右側顯示解析、累計、回覆的流程與耗時。</w:t>
       </w:r>
     </w:p>
     <w:p>
@@ -1024,7 +1024,7 @@
           <w:color w:val="122019"/>
           <w:sz w:val="21"/>
         </w:rPr>
-        <w:t xml:space="preserve">待辦寫入本機 </w:t>
+        <w:t xml:space="preserve">支出寫入本機 </w:t>
       </w:r>
       <w:r>
         <w:rPr>
@@ -1032,7 +1032,7 @@
           <w:color w:val="174D2C"/>
           <w:sz w:val="18"/>
         </w:rPr>
-        <w:t>todo.txt</w:t>
+        <w:t>expenses.txt</w:t>
       </w:r>
       <w:r>
         <w:rPr>
@@ -1053,7 +1053,7 @@
           <w:color w:val="122019"/>
           <w:sz w:val="21"/>
         </w:rPr>
-        <w:t>這個展示頁後來變成整個專案最適合 demo 的部分：它把「AI 查資料」與「待辦捕捉」兩個價值放在同一個畫面，而且不用在課堂上冒著 token 外洩的風險。</w:t>
+        <w:t>這個展示頁後來變成整個專案最適合 demo 的部分：它把「AI 查資料」與「記帳」兩個價值放在同一個畫面，而且不用在課堂上冒著 token 外洩的風險。</w:t>
       </w:r>
     </w:p>
     <w:p>

</xml_diff>